<commit_message>
Update résumés for improved content and formatting
</commit_message>
<xml_diff>
--- a/assets/resumes/michel-ferreira-cv-pt-br-2026.docx
+++ b/assets/resumes/michel-ferreira-cv-pt-br-2026.docx
@@ -163,7 +163,7 @@
           <w:color w:val="1F2937"/>
           <w:sz w:val="18"/>
         </w:rPr>
-        <w:t>Engenheiro de Software Full Stack com 4+ anos de experiência construindo, integrando e sustentando sistemas de negócio. Minha especialidade é transformar regras complexas em software legível, rastreável e operável: backend PHP/Laravel e Python, frontend JavaScript/HTML/CSS, APIs e microsserviços, SQL, AWS, CI/CD e observabilidade. Na Total Express, via Leega, atuo na evolução de sistemas de uma operação logística nacional e de um motor de cálculo fiscal, conectando regras tributárias, integrações, automações e fluxos de processamento.</w:t>
+        <w:t>Engenheiro de Software Full Stack com mais de 4 anos de experiência construindo, integrando e sustentando sistemas de negócio. Minha especialidade é transformar regras complexas em software legível, rastreável e operável: backend PHP/Laravel e Python, frontend JavaScript/HTML/CSS, APIs e microsserviços, SQL, AWS, CI/CD e observabilidade. Na Total Express, via Leega, atuo na evolução de sistemas de uma operação logística nacional e de um motor de cálculo fiscal, conectando regras tributárias, integrações, automações e fluxos de processamento.</w:t>
       </w:r>
     </w:p>
     <w:p>
@@ -329,7 +329,7 @@
           <w:color w:val="123A73"/>
           <w:sz w:val="19"/>
         </w:rPr>
-        <w:t>Engenheiro de Software Full Stack | Leega Consultoria — alocado na Total Express</w:t>
+        <w:t>Engenheiro de Software | Leega Consultoria — alocado na Total Express</w:t>
       </w:r>
     </w:p>
     <w:p>
@@ -361,7 +361,7 @@
           <w:color w:val="1F2937"/>
           <w:sz w:val="17"/>
         </w:rPr>
-        <w:t>• Desenvolvo e evoluo um motor de cálculo fiscal em PHP/Laravel na AWS, convertendo regras tributárias e cenários interestaduais em lógica de aplicação integrada aos sistemas da operação logística.</w:t>
+        <w:t>• Desenvolvo e evoluo um motor de cálculo fiscal em PHP/Laravel na AWS, convertendo regras tributárias e cenários interestaduais em lógica de aplicação integrada aos sistemas de uma operação logística nacional de alto volume transacional.</w:t>
       </w:r>
     </w:p>
     <w:p>
@@ -537,7 +537,7 @@
           <w:color w:val="123A73"/>
           <w:sz w:val="19"/>
         </w:rPr>
-        <w:t>Engenheiro de Software Full Stack | Governo do Estado de Rondônia</w:t>
+        <w:t>Desenvolvedor de Software Full Stack | Governo do Estado de Rondônia</w:t>
       </w:r>
     </w:p>
     <w:p>
@@ -970,7 +970,7 @@
           <w:color w:val="1F2937"/>
           <w:sz w:val="16"/>
         </w:rPr>
-        <w:t>Dashboard cripto em tempo real sem backend, com preços, variações, heatmap, order book, indicadores e gráficos via WebSocket.</w:t>
+        <w:t>Dashboard cripto em tempo real sem backend, com preços, variações, heatmap, order book, indicadores e gráficos via WebSocket. Publicado no GitHub Pages.</w:t>
       </w:r>
     </w:p>
     <w:p>
@@ -1424,7 +1424,7 @@
           <w:color w:val="1F2937"/>
           <w:sz w:val="16"/>
         </w:rPr>
-        <w:t>Segurança, cloud &amp; infraestrutura: Blockchain — FIAP (2026) · Cybersecurity — FIAP (2026) · EHE — Ethical Hacking Essentials — EC-Council · Pentest: Vulnerabilidades em Aplicações Web — Alura (2024) · Getting Started Cloud/AWS — Alura (2024) · Linux Complete &amp; Up-to-Date v2025 — Udemy (2025) · Formação Getting Started Linux — Alura (2024) · Linux Onboarding: usando a CLI de uma forma rápida e prática — Alura (fev 2024).</w:t>
+        <w:t>Segurança, cloud &amp; infraestrutura: Blockchain e Cybersecurity — FIAP (abr 2026) · EHE — Ethical Hacking Essentials — EC-Council · Pentest em Aplicações Web — Alura (mar 2024) · Começando em Cloud com AWS — Alura (jul 2024) · Linux Complete &amp; Up-to-Date v2025 — Udemy (mai 2025) · Formação Começando com Linux e Linux Onboarding CLI — Alura (fev 2024).</w:t>
       </w:r>
     </w:p>
     <w:p>
@@ -1440,7 +1440,7 @@
           <w:color w:val="1F2937"/>
           <w:sz w:val="16"/>
         </w:rPr>
-        <w:t>Backend, web &amp; dados: Formação Aprenda a Programar em PHP — Alura (2024) · PHP OOP: herança, polimorfismo e interfaces — Alura (2024) · PHP Composer — Alura (2024) · Formação Python com OOP — Alura (2024) · C Programming for Beginners — Udemy (2025) · DRUPAL TUTORIAL: Drupal 8 Beginner to Advanced in 8 PROJECTS — Udemy (dez 2023) · SQL com MySQL — Alura (2024) · HTTP: Entendendo a Web — Alura (2024).</w:t>
+        <w:t>Backend, web &amp; dados: Formação PHP e PHP OOP — Alura (mar 2024) · PHP Composer — Alura (abr 2024) · Formação Python com OOP — Alura (mar 2024) · C Programming for Beginners — Udemy (mai 2025) · Drupal 8 Beginner to Advanced — Udemy (dez 2023) · SQL com MySQL — Alura (fev 2024) · HTTP: entendendo a web — Alura (mar 2024).</w:t>
       </w:r>
     </w:p>
     <w:p>
@@ -1456,7 +1456,7 @@
           <w:color w:val="1F2937"/>
           <w:sz w:val="16"/>
         </w:rPr>
-        <w:t>IA, ferramentas &amp; métodos: Imersão IA 2ª edição — Alura (2024) · Python Data Science: funções e estruturas de dados — Alura (2024) · Python Excel para Análise de Dados — Alura (2024) · ChatGPT e Programação — Alura (2024) · Git &amp; GitHub Bootcamp — Udemy (2024) · Vim Masterclass — Udemy (dez 2023) · Visual Studio Code for Developers 2023: Beginner to Advanced — Udemy (nov 2023) · Gestão Ágil com Scrum COMPLETO + 3 Cursos EXTRAS — Udemy (nov 2023) · Git e GitHub do básico ao avançado (c/ gist e GitHub Pages) — Udemy (out 2023) · Algoritmos e Lógica de Programação 2023 — Udemy (set 2023).</w:t>
+        <w:t>IA, ferramentas &amp; métodos: Imersão IA 2ª edição — Alura (mai 2024) · Python Data Science e Imersão Python: Do Excel à Análise de Dados — Alura (abr 2024) · ChatGPT e programação — Alura (mar 2024) · Git &amp; GitHub Bootcamp — Udemy (jun 2024) · Vim Masterclass — Udemy (dez 2023) · VS Code e Scrum — Udemy (nov 2023) · Git e GitHub do básico ao avançado — Udemy (out 2023) · Algoritmos e Lógica de Programação — Udemy (set 2023).</w:t>
       </w:r>
     </w:p>
     <w:p>
@@ -1472,7 +1472,7 @@
           <w:color w:val="1F2937"/>
           <w:sz w:val="16"/>
         </w:rPr>
-        <w:t>Cambridge English: Entry Level Certificate in ESOL International (Entry 3) — 2019 · Entry Level Certificate in ESOL International (Entry 3) (Preliminary) — 2017 · Entry Level Certificate in ESOL International (Entry 2) (Key) — 2016.</w:t>
+        <w:t>Cambridge English: Entry Level Certificate in ESOL International (Entry 3) — dez 2019 · Entry Level Certificate in ESOL International (Entry 3) (Preliminary) — dez 2017 · Entry Level Certificate in ESOL International (Entry 2) (Key) — dez 2016.</w:t>
       </w:r>
     </w:p>
     <w:p>

</xml_diff>